<commit_message>
docs(benchmark): corrige arredondamento da tabela de capacidade por operacao
</commit_message>
<xml_diff>
--- a/docs/BENCHMARK.docx
+++ b/docs/BENCHMARK.docx
@@ -2333,7 +2333,7 @@
               <w:jc w:val="left"/>
             </w:pPr>
             <w:r>
-              <w:t xml:space="preserve">≈ 2.222</w:t>
+              <w:t xml:space="preserve">≈ 2.221</w:t>
             </w:r>
           </w:p>
         </w:tc>
@@ -2383,19 +2383,19 @@
               <w:jc w:val="left"/>
             </w:pPr>
             <w:r>
-              <w:t xml:space="preserve">≈ 394</w:t>
-            </w:r>
-          </w:p>
-        </w:tc>
-        <w:tc>
-          <w:tcPr/>
-          <w:p>
-            <w:pPr>
-              <w:pStyle w:val="Compact"/>
-              <w:jc w:val="left"/>
-            </w:pPr>
-            <w:r>
-              <w:t xml:space="preserve">≈ 65</w:t>
+              <w:t xml:space="preserve">≈ 395</w:t>
+            </w:r>
+          </w:p>
+        </w:tc>
+        <w:tc>
+          <w:tcPr/>
+          <w:p>
+            <w:pPr>
+              <w:pStyle w:val="Compact"/>
+              <w:jc w:val="left"/>
+            </w:pPr>
+            <w:r>
+              <w:t xml:space="preserve">≈ 66</w:t>
             </w:r>
           </w:p>
         </w:tc>
@@ -2445,7 +2445,7 @@
               <w:jc w:val="left"/>
             </w:pPr>
             <w:r>
-              <w:t xml:space="preserve">≈ 33</w:t>
+              <w:t xml:space="preserve">≈ 34</w:t>
             </w:r>
           </w:p>
         </w:tc>

</xml_diff>